<commit_message>
chore: update & cleanup dokumen folder
</commit_message>
<xml_diff>
--- a/dokumen/BAB_IV_dan_V.docx
+++ b/dokumen/BAB_IV_dan_V.docx
@@ -3706,13 +3706,35 @@
     </w:p>
     <w:p>
       <w:pPr>
+        <w:keepNext/>
+        <w:spacing w:before="160" w:after="80" w:line="360" w:lineRule="auto"/>
+        <w:jc w:val="left"/>
+      </w:pPr>
+      <w:r>
+        <w:rPr>
+          <w:rFonts w:ascii="Times New Roman" w:hAnsi="Times New Roman"/>
+          <w:b/>
+          <w:i/>
+          <w:color w:val="000000"/>
+          <w:sz w:val="24"/>
+        </w:rPr>
+        <w:t>4.3.1 Halaman Beranda / Landing Page (Customer View)</w:t>
+      </w:r>
+    </w:p>
+    <w:p>
+      <w:r>
+        <w:t>Halaman beranda platform Rongsok.in menyajikan kalkulator estimasi pendapatan langsung dari sampah daur ulang berdasarkan kategori (Plastik, Kardus, Logam, Kaca). Pengguna dapat melihat statistik sistem (jumlah transaksi, jumlah pengepul, dan jumlah kategori) serta daftar kategori sampah daur ulang utama.</w:t>
+      </w:r>
+    </w:p>
+    <w:p>
+      <w:pPr>
         <w:spacing w:before="240" w:after="120"/>
         <w:jc w:val="center"/>
       </w:pPr>
       <w:r>
         <w:drawing>
           <wp:inline xmlns:a="http://schemas.openxmlformats.org/drawingml/2006/main" xmlns:pic="http://schemas.openxmlformats.org/drawingml/2006/picture">
-            <wp:extent cx="5040000" cy="3543750"/>
+            <wp:extent cx="5040000" cy="3150000"/>
             <wp:docPr id="1" name="Picture 1"/>
             <wp:cNvGraphicFramePr>
               <a:graphicFrameLocks noChangeAspect="1"/>
@@ -3721,7 +3743,7 @@
               <a:graphicData uri="http://schemas.openxmlformats.org/drawingml/2006/picture">
                 <pic:pic>
                   <pic:nvPicPr>
-                    <pic:cNvPr id="0" name="1_landing_page.png"/>
+                    <pic:cNvPr id="0" name=" 01-beranda.png"/>
                     <pic:cNvPicPr/>
                   </pic:nvPicPr>
                   <pic:blipFill>
@@ -3733,7 +3755,7 @@
                   <pic:spPr>
                     <a:xfrm>
                       <a:off x="0" y="0"/>
-                      <a:ext cx="5040000" cy="3543750"/>
+                      <a:ext cx="5040000" cy="3150000"/>
                     </a:xfrm>
                     <a:prstGeom prst="rect"/>
                   </pic:spPr>
@@ -3761,13 +3783,35 @@
     </w:p>
     <w:p>
       <w:pPr>
+        <w:keepNext/>
+        <w:spacing w:before="160" w:after="80" w:line="360" w:lineRule="auto"/>
+        <w:jc w:val="left"/>
+      </w:pPr>
+      <w:r>
+        <w:rPr>
+          <w:rFonts w:ascii="Times New Roman" w:hAnsi="Times New Roman"/>
+          <w:b/>
+          <w:i/>
+          <w:color w:val="000000"/>
+          <w:sz w:val="24"/>
+        </w:rPr>
+        <w:t>4.3.2 Dasbor Pelanggan (Customer Dashboard)</w:t>
+      </w:r>
+    </w:p>
+    <w:p>
+      <w:r>
+        <w:t>Menampilkan ringkasan akun pelanggan termasuk total berat sampah terdaur ulang, total pendapatan, spanduk peringkat dampak ekologis, akses cepat "Jual Cepat per Kategori", lokasi pengepul terdekat (seperti Lapak Jan Yogyakarta) lengkap dengan tombol "Jual", serta riwayat setoran terakhir.</w:t>
+      </w:r>
+    </w:p>
+    <w:p>
+      <w:pPr>
         <w:spacing w:before="240" w:after="120"/>
         <w:jc w:val="center"/>
       </w:pPr>
       <w:r>
         <w:drawing>
           <wp:inline xmlns:a="http://schemas.openxmlformats.org/drawingml/2006/main" xmlns:pic="http://schemas.openxmlformats.org/drawingml/2006/picture">
-            <wp:extent cx="5040000" cy="3543750"/>
+            <wp:extent cx="5040000" cy="3150000"/>
             <wp:docPr id="2" name="Picture 2"/>
             <wp:cNvGraphicFramePr>
               <a:graphicFrameLocks noChangeAspect="1"/>
@@ -3776,7 +3820,7 @@
               <a:graphicData uri="http://schemas.openxmlformats.org/drawingml/2006/picture">
                 <pic:pic>
                   <pic:nvPicPr>
-                    <pic:cNvPr id="0" name="2_register_login.png"/>
+                    <pic:cNvPr id="0" name="02-dashboard customer.png"/>
                     <pic:cNvPicPr/>
                   </pic:nvPicPr>
                   <pic:blipFill>
@@ -3788,7 +3832,7 @@
                   <pic:spPr>
                     <a:xfrm>
                       <a:off x="0" y="0"/>
-                      <a:ext cx="5040000" cy="3543750"/>
+                      <a:ext cx="5040000" cy="3150000"/>
                     </a:xfrm>
                     <a:prstGeom prst="rect"/>
                   </pic:spPr>
@@ -3811,7 +3855,29 @@
           <w:color w:val="000000"/>
           <w:sz w:val="22"/>
         </w:rPr>
-        <w:t>Gambar 4.2 Halaman Pendaftaran &amp; Masuk (Login &amp; Register)</w:t>
+        <w:t>Gambar 4.2 Dasbor Pelanggan (Customer Dashboard)</w:t>
+      </w:r>
+    </w:p>
+    <w:p>
+      <w:pPr>
+        <w:keepNext/>
+        <w:spacing w:before="160" w:after="80" w:line="360" w:lineRule="auto"/>
+        <w:jc w:val="left"/>
+      </w:pPr>
+      <w:r>
+        <w:rPr>
+          <w:rFonts w:ascii="Times New Roman" w:hAnsi="Times New Roman"/>
+          <w:b/>
+          <w:i/>
+          <w:color w:val="000000"/>
+          <w:sz w:val="24"/>
+        </w:rPr>
+        <w:t>4.3.3 Formulir Pembuatan Pesanan Baru (New Order Wizard)</w:t>
+      </w:r>
+    </w:p>
+    <w:p>
+      <w:r>
+        <w:t>Alur pengisian detail sampah yang akan dijual, di mana pelanggan dapat menginput rincian item (kategori, jumlah, satuan) dan mengunggah foto tumpukan rongsok secara langsung. Formulir menggunakan visualisasi progress bar multi-langkah (multi-step wizard).</w:t>
       </w:r>
     </w:p>
     <w:p>
@@ -3822,7 +3888,7 @@
       <w:r>
         <w:drawing>
           <wp:inline xmlns:a="http://schemas.openxmlformats.org/drawingml/2006/main" xmlns:pic="http://schemas.openxmlformats.org/drawingml/2006/picture">
-            <wp:extent cx="5040000" cy="3543750"/>
+            <wp:extent cx="5040000" cy="3150000"/>
             <wp:docPr id="3" name="Picture 3"/>
             <wp:cNvGraphicFramePr>
               <a:graphicFrameLocks noChangeAspect="1"/>
@@ -3831,7 +3897,7 @@
               <a:graphicData uri="http://schemas.openxmlformats.org/drawingml/2006/picture">
                 <pic:pic>
                   <pic:nvPicPr>
-                    <pic:cNvPr id="0" name="3_customer_dashboard.png"/>
+                    <pic:cNvPr id="0" name="03-membuat pesanan.png"/>
                     <pic:cNvPicPr/>
                   </pic:nvPicPr>
                   <pic:blipFill>
@@ -3843,7 +3909,7 @@
                   <pic:spPr>
                     <a:xfrm>
                       <a:off x="0" y="0"/>
-                      <a:ext cx="5040000" cy="3543750"/>
+                      <a:ext cx="5040000" cy="3150000"/>
                     </a:xfrm>
                     <a:prstGeom prst="rect"/>
                   </pic:spPr>
@@ -3866,7 +3932,29 @@
           <w:color w:val="000000"/>
           <w:sz w:val="22"/>
         </w:rPr>
-        <w:t>Gambar 4.3 Dasbor Pelanggan (Customer Dashboard)</w:t>
+        <w:t>Gambar 4.3 Formulir Pembuatan Pesanan Baru (New Order Wizard)</w:t>
+      </w:r>
+    </w:p>
+    <w:p>
+      <w:pPr>
+        <w:keepNext/>
+        <w:spacing w:before="160" w:after="80" w:line="360" w:lineRule="auto"/>
+        <w:jc w:val="left"/>
+      </w:pPr>
+      <w:r>
+        <w:rPr>
+          <w:rFonts w:ascii="Times New Roman" w:hAnsi="Times New Roman"/>
+          <w:b/>
+          <w:i/>
+          <w:color w:val="000000"/>
+          <w:sz w:val="24"/>
+        </w:rPr>
+        <w:t>4.3.4 Halaman Pelacakan &amp; Status Pesanan Customer</w:t>
+      </w:r>
+    </w:p>
+    <w:p>
+      <w:r>
+        <w:t>Menampilkan status real-time perjalanan pesanan (Menunggu, Diterima, Sampai, Timbang, Selesai). Pelanggan dapat melihat ID Transaksi, tanggal masuk, detail item, foto sampah yang diunggah, metode penyerahan, serta opsi untuk membatalkan pesanan jika diperlukan.</w:t>
       </w:r>
     </w:p>
     <w:p>
@@ -3877,7 +3965,7 @@
       <w:r>
         <w:drawing>
           <wp:inline xmlns:a="http://schemas.openxmlformats.org/drawingml/2006/main" xmlns:pic="http://schemas.openxmlformats.org/drawingml/2006/picture">
-            <wp:extent cx="5040000" cy="3543750"/>
+            <wp:extent cx="5040000" cy="3150000"/>
             <wp:docPr id="4" name="Picture 4"/>
             <wp:cNvGraphicFramePr>
               <a:graphicFrameLocks noChangeAspect="1"/>
@@ -3886,7 +3974,7 @@
               <a:graphicData uri="http://schemas.openxmlformats.org/drawingml/2006/picture">
                 <pic:pic>
                   <pic:nvPicPr>
-                    <pic:cNvPr id="0" name="4_new_order_form.png"/>
+                    <pic:cNvPr id="0" name="03-menunggu pengepul .png"/>
                     <pic:cNvPicPr/>
                   </pic:nvPicPr>
                   <pic:blipFill>
@@ -3898,7 +3986,7 @@
                   <pic:spPr>
                     <a:xfrm>
                       <a:off x="0" y="0"/>
-                      <a:ext cx="5040000" cy="3543750"/>
+                      <a:ext cx="5040000" cy="3150000"/>
                     </a:xfrm>
                     <a:prstGeom prst="rect"/>
                   </pic:spPr>
@@ -3921,7 +4009,29 @@
           <w:color w:val="000000"/>
           <w:sz w:val="22"/>
         </w:rPr>
-        <w:t>Gambar 4.4 Formulir Pembuatan Pesanan Baru (New Order Wizard)</w:t>
+        <w:t>Gambar 4.4 Halaman Pelacakan &amp; Status Pesanan Customer</w:t>
+      </w:r>
+    </w:p>
+    <w:p>
+      <w:pPr>
+        <w:keepNext/>
+        <w:spacing w:before="160" w:after="80" w:line="360" w:lineRule="auto"/>
+        <w:jc w:val="left"/>
+      </w:pPr>
+      <w:r>
+        <w:rPr>
+          <w:rFonts w:ascii="Times New Roman" w:hAnsi="Times New Roman"/>
+          <w:b/>
+          <w:i/>
+          <w:color w:val="000000"/>
+          <w:sz w:val="24"/>
+        </w:rPr>
+        <w:t>4.3.5 Dasbor Pengepul dengan Antrean Order Masuk</w:t>
+      </w:r>
+    </w:p>
+    <w:p>
+      <w:r>
+        <w:t>Dasbor pengepul menampilkan toggle status buka/tutup lapak secara dinamis. Pengepul dapat melihat permintaan jemput terdekat dalam radius layanan mereka dan meninjau antrean masuk (lengkap dengan foto sampah asli dari pelanggan) untuk diambil atau ditolak langsung.</w:t>
       </w:r>
     </w:p>
     <w:p>
@@ -3932,7 +4042,7 @@
       <w:r>
         <w:drawing>
           <wp:inline xmlns:a="http://schemas.openxmlformats.org/drawingml/2006/main" xmlns:pic="http://schemas.openxmlformats.org/drawingml/2006/picture">
-            <wp:extent cx="5040000" cy="3543750"/>
+            <wp:extent cx="5040000" cy="2835000"/>
             <wp:docPr id="5" name="Picture 5"/>
             <wp:cNvGraphicFramePr>
               <a:graphicFrameLocks noChangeAspect="1"/>
@@ -3941,7 +4051,7 @@
               <a:graphicData uri="http://schemas.openxmlformats.org/drawingml/2006/picture">
                 <pic:pic>
                   <pic:nvPicPr>
-                    <pic:cNvPr id="0" name="5_collector_dashboard.png"/>
+                    <pic:cNvPr id="0" name="04-tampilan dashboard pengepul (ada order).png"/>
                     <pic:cNvPicPr/>
                   </pic:nvPicPr>
                   <pic:blipFill>
@@ -3953,7 +4063,7 @@
                   <pic:spPr>
                     <a:xfrm>
                       <a:off x="0" y="0"/>
-                      <a:ext cx="5040000" cy="3543750"/>
+                      <a:ext cx="5040000" cy="2835000"/>
                     </a:xfrm>
                     <a:prstGeom prst="rect"/>
                   </pic:spPr>
@@ -3976,7 +4086,29 @@
           <w:color w:val="000000"/>
           <w:sz w:val="22"/>
         </w:rPr>
-        <w:t>Gambar 4.5 Dasbor Pengepul dengan Peta Geospasial Yogyakarta (Collector Dashboard)</w:t>
+        <w:t>Gambar 4.5 Dasbor Pengepul dengan Antrean Order Masuk</w:t>
+      </w:r>
+    </w:p>
+    <w:p>
+      <w:pPr>
+        <w:keepNext/>
+        <w:spacing w:before="160" w:after="80" w:line="360" w:lineRule="auto"/>
+        <w:jc w:val="left"/>
+      </w:pPr>
+      <w:r>
+        <w:rPr>
+          <w:rFonts w:ascii="Times New Roman" w:hAnsi="Times New Roman"/>
+          <w:b/>
+          <w:i/>
+          <w:color w:val="000000"/>
+          <w:sz w:val="24"/>
+        </w:rPr>
+        <w:t>4.3.6 Validasi Timbangan &amp; Persetujuan Transaksi</w:t>
+      </w:r>
+    </w:p>
+    <w:p>
+      <w:r>
+        <w:t>Halaman pelacakan pada sisi Customer ketika status pesanan memasuki tahap penimbangan lapangan (tahap ke-4). Halaman ini menampilkan rute peta real-time, detail rincian harga aktual dari pengepul, tombol hubungi pengepul via WhatsApp, serta tombol "Setujui &amp; Selesaikan" untuk mengesahkan transaksi.</w:t>
       </w:r>
     </w:p>
     <w:p>
@@ -3987,7 +4119,7 @@
       <w:r>
         <w:drawing>
           <wp:inline xmlns:a="http://schemas.openxmlformats.org/drawingml/2006/main" xmlns:pic="http://schemas.openxmlformats.org/drawingml/2006/picture">
-            <wp:extent cx="5040000" cy="3543750"/>
+            <wp:extent cx="5040000" cy="3150000"/>
             <wp:docPr id="6" name="Picture 6"/>
             <wp:cNvGraphicFramePr>
               <a:graphicFrameLocks noChangeAspect="1"/>
@@ -3996,7 +4128,7 @@
               <a:graphicData uri="http://schemas.openxmlformats.org/drawingml/2006/picture">
                 <pic:pic>
                   <pic:nvPicPr>
-                    <pic:cNvPr id="0" name="6_collector_cod_stats.png"/>
+                    <pic:cNvPr id="0" name="05-kesepakatan transaksi.png"/>
                     <pic:cNvPicPr/>
                   </pic:nvPicPr>
                   <pic:blipFill>
@@ -4008,7 +4140,7 @@
                   <pic:spPr>
                     <a:xfrm>
                       <a:off x="0" y="0"/>
-                      <a:ext cx="5040000" cy="3543750"/>
+                      <a:ext cx="5040000" cy="3150000"/>
                     </a:xfrm>
                     <a:prstGeom prst="rect"/>
                   </pic:spPr>
@@ -4031,7 +4163,29 @@
           <w:color w:val="000000"/>
           <w:sz w:val="22"/>
         </w:rPr>
-        <w:t>Gambar 4.6 Dompet E-Wallet &amp; Modal Tarik Saldo (Collector Wallet)</w:t>
+        <w:t>Gambar 4.6 Validasi Timbangan &amp; Persetujuan Transaksi</w:t>
+      </w:r>
+    </w:p>
+    <w:p>
+      <w:pPr>
+        <w:keepNext/>
+        <w:spacing w:before="160" w:after="80" w:line="360" w:lineRule="auto"/>
+        <w:jc w:val="left"/>
+      </w:pPr>
+      <w:r>
+        <w:rPr>
+          <w:rFonts w:ascii="Times New Roman" w:hAnsi="Times New Roman"/>
+          <w:b/>
+          <w:i/>
+          <w:color w:val="000000"/>
+          <w:sz w:val="24"/>
+        </w:rPr>
+        <w:t>4.3.7 Modal Apresiasi Dampak Ekologis (Eco Impact Card)</w:t>
+      </w:r>
+    </w:p>
+    <w:p>
+      <w:r>
+        <w:t>Kartu apresiasi dampak ekologis berbentuk modal pop-up interaktif pasca penyelesaian transaksi. Kartu ini menampilkan kontribusi daur ulang (misalnya 1.0 kg sampah) beserta konversi reduksi emisi karbon yang setara jarak tempuh motor (5.0 km), tombol "Unduh Gambar" untuk menyimpan kartu berformat PNG, serta tombol lanjut untuk memberikan rating pengepul.</w:t>
       </w:r>
     </w:p>
     <w:p>
@@ -4042,7 +4196,7 @@
       <w:r>
         <w:drawing>
           <wp:inline xmlns:a="http://schemas.openxmlformats.org/drawingml/2006/main" xmlns:pic="http://schemas.openxmlformats.org/drawingml/2006/picture">
-            <wp:extent cx="5040000" cy="3543750"/>
+            <wp:extent cx="5040000" cy="3150000"/>
             <wp:docPr id="7" name="Picture 7"/>
             <wp:cNvGraphicFramePr>
               <a:graphicFrameLocks noChangeAspect="1"/>
@@ -4051,7 +4205,7 @@
               <a:graphicData uri="http://schemas.openxmlformats.org/drawingml/2006/picture">
                 <pic:pic>
                   <pic:nvPicPr>
-                    <pic:cNvPr id="0" name="7_ktp_ocr_verify.png"/>
+                    <pic:cNvPr id="0" name="06-eco impact card.png"/>
                     <pic:cNvPicPr/>
                   </pic:nvPicPr>
                   <pic:blipFill>
@@ -4063,7 +4217,7 @@
                   <pic:spPr>
                     <a:xfrm>
                       <a:off x="0" y="0"/>
-                      <a:ext cx="5040000" cy="3543750"/>
+                      <a:ext cx="5040000" cy="3150000"/>
                     </a:xfrm>
                     <a:prstGeom prst="rect"/>
                   </pic:spPr>
@@ -4086,62 +4240,7 @@
           <w:color w:val="000000"/>
           <w:sz w:val="22"/>
         </w:rPr>
-        <w:t>Gambar 4.7 Konsol Verifikasi KYC Admin (Admin Verification Panel)</w:t>
-      </w:r>
-    </w:p>
-    <w:p>
-      <w:pPr>
-        <w:spacing w:before="240" w:after="120"/>
-        <w:jc w:val="center"/>
-      </w:pPr>
-      <w:r>
-        <w:drawing>
-          <wp:inline xmlns:a="http://schemas.openxmlformats.org/drawingml/2006/main" xmlns:pic="http://schemas.openxmlformats.org/drawingml/2006/picture">
-            <wp:extent cx="5040000" cy="3543750"/>
-            <wp:docPr id="8" name="Picture 8"/>
-            <wp:cNvGraphicFramePr>
-              <a:graphicFrameLocks noChangeAspect="1"/>
-            </wp:cNvGraphicFramePr>
-            <a:graphic>
-              <a:graphicData uri="http://schemas.openxmlformats.org/drawingml/2006/picture">
-                <pic:pic>
-                  <pic:nvPicPr>
-                    <pic:cNvPr id="0" name="8_order_receipt.png"/>
-                    <pic:cNvPicPr/>
-                  </pic:nvPicPr>
-                  <pic:blipFill>
-                    <a:blip r:embed="rId16"/>
-                    <a:stretch>
-                      <a:fillRect/>
-                    </a:stretch>
-                  </pic:blipFill>
-                  <pic:spPr>
-                    <a:xfrm>
-                      <a:off x="0" y="0"/>
-                      <a:ext cx="5040000" cy="3543750"/>
-                    </a:xfrm>
-                    <a:prstGeom prst="rect"/>
-                  </pic:spPr>
-                </pic:pic>
-              </a:graphicData>
-            </a:graphic>
-          </wp:inline>
-        </w:drawing>
-      </w:r>
-    </w:p>
-    <w:p>
-      <w:pPr>
-        <w:spacing w:before="80" w:after="360"/>
-        <w:jc w:val="center"/>
-      </w:pPr>
-      <w:r>
-        <w:rPr>
-          <w:rFonts w:ascii="Times New Roman" w:hAnsi="Times New Roman"/>
-          <w:b/>
-          <w:color w:val="000000"/>
-          <w:sz w:val="22"/>
-        </w:rPr>
-        <w:t>Gambar 4.8 Pelacakan Pesanan Waktu Nyata &amp; Struk Digital (Order Track &amp; Digital Receipt)</w:t>
+        <w:t>Gambar 4.7 Modal Apresiasi Dampak Ekologis (Eco Impact Card)</w:t>
       </w:r>
     </w:p>
     <w:p>

</xml_diff>